<commit_message>
court(okla): certificate signer after the tail, index group headings in capitals; motion-brief gated, petition-for-writ gated on docx (fb-595.54.53)
Co-Authored-By: Claude Opus 5.5 <noreply@anthropic.com>

The Oklahoma INPUTs get back the arrows and closing quotation marks of the filed briefs, which pass 1 (6064ee01f) had flattened to -> and straight quotes before the model set them.

Reverts: 6064ee01f07282209d7daf50b8b11df9abc8cb4d
</commit_message>
<xml_diff>
--- a/courts/tenth-circuit/oklahoma/state/supreme-court/amicus-brief/usage/OUTPUT-amicus-brief.docx
+++ b/courts/tenth-circuit/oklahoma/state/supreme-court/amicus-brief/usage/OUTPUT-amicus-brief.docx
@@ -1631,7 +1631,7 @@
         <w:tab/>
       </w:r>
       <w:r>
-        <w:t xml:space="preserve">4</w:t>
+        <w:t xml:space="preserve">5</w:t>
       </w:r>
     </w:p>
     <w:p>
@@ -3247,7 +3247,7 @@
         <w:tab/>
       </w:r>
       <w:r>
-        <w:t xml:space="preserve">20</w:t>
+        <w:t xml:space="preserve">21</w:t>
       </w:r>
     </w:p>
     <w:p>
@@ -3281,7 +3281,7 @@
         <w:tab/>
       </w:r>
       <w:r>
-        <w:t xml:space="preserve">21</w:t>
+        <w:t xml:space="preserve">22</w:t>
       </w:r>
     </w:p>
     <w:p>
@@ -3431,7 +3431,7 @@
         <w:pStyle w:val="XdQuoteOnly"/>
       </w:pPr>
       <w:r>
-        <w:t xml:space="preserve">secure to the said Choctaw Nation of Red People the jurisdiction of government of all the persons and property that may be within their limits west, so that no Territory or State shall ever have a right to pass laws for the government of the Choctaw Nation of Red People and their descendants . . . ; but that the U.S. shall forever secure said Choctaw Nation from . . . all laws except . . . their own . . . not inconsistent with the . . . Laws of the United States . . . .</w:t>
+        <w:t xml:space="preserve">secure to the said Choctaw Nation of Red People the jurisdiction of government of all the persons and property that may be within their limits west, so that no Territory or State shall ever have a right to pass laws for the government of the Choctaw Nation of Red People and their descendants . . . ; but that the U.S. shall forever secure said Choctaw Nation from . . . all laws except . . . their own . . . not inconsistent with the . . . Laws of the United States . . . .</w:t>
       </w:r>
     </w:p>
     <w:p>
@@ -4387,7 +4387,7 @@
         <w:pStyle w:val="XdQuoteFirst"/>
       </w:pPr>
       <w:r>
-        <w:t xml:space="preserve">In the event that either party to this Compact believes that the other party has failed to comply with any requirement of this Compact, or in the event of any dispute hereunder, including . . . dispute[s] over the proper interpretation of the . . . Compact . . . :</w:t>
+        <w:t xml:space="preserve">In the event that either party to this Compact believes that the other party has failed to comply with any requirement of this Compact, or in the event of any dispute hereunder, including . . . dispute[s] over the proper interpretation of the . . . Compact . . . :</w:t>
       </w:r>
     </w:p>
     <w:p>
@@ -4395,7 +4395,7 @@
         <w:pStyle w:val="XdQuoteLast"/>
       </w:pPr>
       <w:r>
-        <w:t xml:space="preserve">2. [E]ither party may refer a dispute arising under this Compact to arbitration . . . subject to enforcement or pursuant to review as provided by paragraph 3 of this Part by a federal district court. [E]ither party . . . may bring an action against the other in a federal district court for the de novo review of any arbitration award . . . .</w:t>
+        <w:t xml:space="preserve">2. [E]ither party may refer a dispute arising under this Compact to arbitration . . . subject to enforcement or pursuant to review as provided by paragraph 3 of this Part by a federal district court. [E]ither party . . . may bring an action against the other in a federal district court for the de novo review of any arbitration award . . . .</w:t>
       </w:r>
     </w:p>
     <w:p>
@@ -6225,7 +6225,7 @@
         <w:t xml:space="preserve">Blatchford</w:t>
       </w:r>
       <w:r>
-        <w:t xml:space="preserve">, the Supreme Court . . . explained</w:t>
+        <w:t xml:space="preserve">, the Supreme Court . . . explained</w:t>
       </w:r>
       <w:r>
         <w:t xml:space="preserve"> </w:t>
@@ -6924,7 +6924,7 @@
         <w:t xml:space="preserve"> </w:t>
       </w:r>
       <w:r>
-        <w:t xml:space="preserve">“Indian sovereignty doctrine . . . provides a backdrop against which the applicable treaties and federal statutes must be read,”</w:t>
+        <w:t xml:space="preserve">“Indian sovereignty doctrine . . . provides a backdrop against which the applicable treaties and federal statutes must be read,”</w:t>
       </w:r>
       <w:r>
         <w:t xml:space="preserve"> </w:t>
@@ -8141,7 +8141,7 @@
         <w:t xml:space="preserve">, 154 P.3d 644, 649 (N.M. 2007) (</w:t>
       </w:r>
       <w:r>
-        <w:t xml:space="preserve">“[A]s a general proposition of Indian law . . . tribal courts have exclusive jurisdiction over claims arising on tribal lands against tribes . . . .”</w:t>
+        <w:t xml:space="preserve">“[A]s a general proposition of Indian law . . . tribal courts have exclusive jurisdiction over claims arising on tribal lands against tribes . . . .”</w:t>
       </w:r>
       <w:r>
         <w:t xml:space="preserve"> </w:t>
@@ -9234,7 +9234,7 @@
         <w:t xml:space="preserve"> </w:t>
       </w:r>
       <w:r>
-        <w:t xml:space="preserve">“Congress has always been at liberty to dispense with . . . tribal immunity or to limit it,”</w:t>
+        <w:t xml:space="preserve">“Congress has always been at liberty to dispense with . . . tribal immunity or to limit it,”</w:t>
       </w:r>
       <w:r>
         <w:t xml:space="preserve"> </w:t>
@@ -9288,7 +9288,7 @@
         <w:t xml:space="preserve"> </w:t>
       </w:r>
       <w:r>
-        <w:t xml:space="preserve">“[t]ribal immunity . . . is not subject to diminution by the States,”</w:t>
+        <w:t xml:space="preserve">“[t]ribal immunity . . . is not subject to diminution by the States,”</w:t>
       </w:r>
       <w:r>
         <w:t xml:space="preserve"> </w:t>
@@ -9491,7 +9491,7 @@
         <w:t xml:space="preserve">, ¶ 35 (</w:t>
       </w:r>
       <w:r>
-        <w:t xml:space="preserve">“[A]mbiguity in the Compact . . . would require resolution in favor of the Tribe.”</w:t>
+        <w:t xml:space="preserve">“[A]mbiguity in the Compact . . . would require resolution in favor of the Tribe.”</w:t>
       </w:r>
       <w:r>
         <w:t xml:space="preserve">).</w:t>
@@ -10314,20 +10314,79 @@
     </w:p>
     <w:p>
       <w:pPr>
-        <w:pStyle w:val="XdTail"/>
+        <w:spacing w:before="0" w:after="0" w:line="384" w:lineRule="exact"/>
       </w:pPr>
-      <w:r>
-        <w:t xml:space="preserve">Robert L. Rabon</w:t>
-      </w:r>
     </w:p>
-    <w:p>
-      <w:pPr>
-        <w:pStyle w:val="XdTail"/>
-      </w:pPr>
-      <w:r>
-        <w:t xml:space="preserve">Stephen H. Greetham</w:t>
-      </w:r>
-    </w:p>
+    <w:tbl>
+      <w:tblPr>
+        <w:tblW w:w="9000" w:type="dxa"/>
+        <w:tblLayout w:type="fixed"/>
+        <w:tblCellMar>
+          <w:top w:w="0" w:type="dxa"/>
+          <w:left w:w="0" w:type="dxa"/>
+          <w:bottom w:w="0" w:type="dxa"/>
+          <w:right w:w="0" w:type="dxa"/>
+        </w:tblCellMar>
+        <w:tblLook w:val="0000" w:firstRow="0" w:lastRow="0" w:firstColumn="0" w:lastColumn="0" w:noHBand="0" w:noVBand="0"/>
+      </w:tblPr>
+      <w:tblGrid>
+        <w:gridCol w:w="9000"/>
+      </w:tblGrid>
+      <w:tr>
+        <w:trPr>
+          <w:cantSplit/>
+        </w:trPr>
+        <w:tc>
+          <w:tcPr>
+            <w:tcW w:w="9000" w:type="dxa"/>
+          </w:tcPr>
+          <w:p>
+            <w:pPr>
+              <w:spacing w:before="0" w:after="0" w:line="276" w:lineRule="exact"/>
+              <w:ind w:left="4320" w:firstLine="0"/>
+              <w:jc w:val="left"/>
+            </w:pPr>
+            <w:r>
+              <w:t xml:space="preserve">Robert</w:t>
+            </w:r>
+            <w:r>
+              <w:t xml:space="preserve"> </w:t>
+            </w:r>
+            <w:r>
+              <w:t xml:space="preserve">L.</w:t>
+            </w:r>
+            <w:r>
+              <w:t xml:space="preserve"> </w:t>
+            </w:r>
+            <w:r>
+              <w:t xml:space="preserve">Rabon</w:t>
+            </w:r>
+          </w:p>
+          <w:p>
+            <w:pPr>
+              <w:spacing w:before="0" w:after="0" w:line="276" w:lineRule="exact"/>
+              <w:ind w:left="4320" w:firstLine="0"/>
+              <w:jc w:val="left"/>
+            </w:pPr>
+            <w:r>
+              <w:t xml:space="preserve">Stephen</w:t>
+            </w:r>
+            <w:r>
+              <w:t xml:space="preserve"> </w:t>
+            </w:r>
+            <w:r>
+              <w:t xml:space="preserve">H.</w:t>
+            </w:r>
+            <w:r>
+              <w:t xml:space="preserve"> </w:t>
+            </w:r>
+            <w:r>
+              <w:t xml:space="preserve">Greetham</w:t>
+            </w:r>
+          </w:p>
+        </w:tc>
+      </w:tr>
+    </w:tbl>
     <w:sectPr>
       <w:footerReference w:type="default" r:id="rIdXdPage"/>
       <w:pgSz w:w="12240" w:h="15840"/>
@@ -10780,13 +10839,7 @@
         <w:t xml:space="preserve"> </w:t>
       </w:r>
       <w:r>
-        <w:t xml:space="preserve">¶¶ 48</w:t>
-      </w:r>
-      <w:r>
-        <w:noBreakHyphen/>
-      </w:r>
-      <w:r>
-        <w:t xml:space="preserve">52; (4)</w:t>
+        <w:t xml:space="preserve">¶¶ 48-⁠52; (4)</w:t>
       </w:r>
       <w:r>
         <w:t xml:space="preserve"> </w:t>
@@ -10827,13 +10880,7 @@
         <w:t xml:space="preserve"> </w:t>
       </w:r>
       <w:r>
-        <w:t xml:space="preserve">¶¶ 33</w:t>
-      </w:r>
-      <w:r>
-        <w:noBreakHyphen/>
-      </w:r>
-      <w:r>
-        <w:t xml:space="preserve">34; and (5) perhaps most importantly,</w:t>
+        <w:t xml:space="preserve">¶¶ 33-⁠34; and (5) perhaps most importantly,</w:t>
       </w:r>
       <w:r>
         <w:t xml:space="preserve"> </w:t>
@@ -11131,7 +11178,7 @@
         <w:t xml:space="preserve">, 447 U.S. 134, 154 (1980) (</w:t>
       </w:r>
       <w:r>
-        <w:t xml:space="preserve">“[I]t must be remembered that tribal sovereignty is . . . subordinate to only the Federal Government, not the States.”</w:t>
+        <w:t xml:space="preserve">“[I]t must be remembered that tribal sovereignty is . . . subordinate to only the Federal Government, not the States.”</w:t>
       </w:r>
       <w:r>
         <w:t xml:space="preserve">).</w:t>
@@ -11516,7 +11563,7 @@
         <w:t xml:space="preserve">U.S. CONST. art. VI, para. 2 (</w:t>
       </w:r>
       <w:r>
-        <w:t xml:space="preserve">“[T]he Laws of the United States . . . shall be the supreme Law of the Land; and the Judges in every State shall be bound thereby, any Thing in the Constitution or Laws of any State to the Contrary notwithstanding.”</w:t>
+        <w:t xml:space="preserve">“[T]he Laws of the United States . . . shall be the supreme Law of the Land; and the Judges in every State shall be bound thereby, any Thing in the Constitution or Laws of any State to the Contrary notwithstanding.”</w:t>
       </w:r>
       <w:r>
         <w:t xml:space="preserve">) (emphasis added).</w:t>
@@ -11750,7 +11797,7 @@
         <w:t xml:space="preserve"> </w:t>
       </w:r>
       <w:r>
-        <w:t xml:space="preserve">“[t]hat a determination of the question of fact as to who are the heirs of any deceased citizen allottee of the Five Civilized Tribes . . . [may be appealed] to the court provided by law for the appeal in cases of appeal in probate matters generally”</w:t>
+        <w:t xml:space="preserve">“[t]hat a determination of the question of fact as to who are the heirs of any deceased citizen allottee of the Five Civilized Tribes . . . [may be appealed] to the court provided by law for the appeal in cases of appeal in probate matters generally”</w:t>
       </w:r>
       <w:r>
         <w:t xml:space="preserve">); Act of Apr. 10, 1926, ch. 115, § 1, 44 Stat. 239, 240 (retroactively validating all conveyances by full-blood Indian heirs previously approved by Oklahoma probate courts under the authority of Section 9 of the Act of May 27, 1908,</w:t>
@@ -12453,7 +12500,7 @@
         <w:t xml:space="preserve"> </w:t>
       </w:r>
       <w:r>
-        <w:t xml:space="preserve">“Part 12 . . . includes a more precise consent to jurisdiction than Part 6,”</w:t>
+        <w:t xml:space="preserve">“Part 12 . . . includes a more precise consent to jurisdiction than Part 6,”</w:t>
       </w:r>
       <w:r>
         <w:t xml:space="preserve"> </w:t>
@@ -13211,6 +13258,7 @@
     <w:unhideWhenUsed/>
     <w:qFormat/>
     <w:pPr>
+      <w:keepLines/>
       <w:spacing w:before="0" w:after="120" w:line="253" w:lineRule="exact"/>
     </w:pPr>
     <w:rPr>
@@ -13461,6 +13509,33 @@
     <w:pPr>
       <w:spacing w:before="0" w:after="0" w:line="552" w:lineRule="exact"/>
       <w:ind w:left="2160" w:hanging="720"/>
+    </w:pPr>
+  </w:style>
+  <w:style w:type="paragraph" w:customStyle="1" w:styleId="XdQuoteList1">
+    <w:name w:val="Xd Quote List 1"/>
+    <w:basedOn w:val="Normal"/>
+    <w:qFormat/>
+    <w:pPr>
+      <w:spacing w:before="0" w:after="0" w:line="276" w:lineRule="exact"/>
+      <w:ind w:left="1440" w:right="720" w:hanging="720"/>
+    </w:pPr>
+  </w:style>
+  <w:style w:type="paragraph" w:customStyle="1" w:styleId="XdQuoteList2">
+    <w:name w:val="Xd Quote List 2"/>
+    <w:basedOn w:val="Normal"/>
+    <w:qFormat/>
+    <w:pPr>
+      <w:spacing w:before="0" w:after="0" w:line="276" w:lineRule="exact"/>
+      <w:ind w:left="2160" w:right="720" w:hanging="720"/>
+    </w:pPr>
+  </w:style>
+  <w:style w:type="paragraph" w:customStyle="1" w:styleId="XdQuoteList3">
+    <w:name w:val="Xd Quote List 3"/>
+    <w:basedOn w:val="Normal"/>
+    <w:qFormat/>
+    <w:pPr>
+      <w:spacing w:before="0" w:after="0" w:line="276" w:lineRule="exact"/>
+      <w:ind w:left="2880" w:right="720" w:hanging="720"/>
     </w:pPr>
   </w:style>
   <w:style w:type="paragraph" w:customStyle="1" w:styleId="XdQuoteFirst">

</xml_diff>